<commit_message>
Member program screens: portal (tier, points, vouchers, shop, reserve, rating, profile), staff tabs (top spenders, insights, feedback, member prices, lost sales, rules), counter vouchers and lost-sale log, chat-app campaigns with vouchers and results, reservations page; guides, decisions, simulation steps and acceptance tests updated
Co-Authored-By: Claude Sonnet 5.5 <noreply@anthropic.com>
Claude-Session: https://claude.ai/code/session_01611rAAsm4xgneCTG3N9mPf
</commit_message>
<xml_diff>
--- a/docs/acceptance-test/per-user/09-sales.westave.docx
+++ b/docs/acceptance-test/per-user/09-sales.westave.docx
@@ -117,7 +117,7 @@
           <w:sz w:val="18"/>
           <w:szCs w:val="18"/>
         </w:rPr>
-        <w:t xml:space="preserve">  ·  52 checks</w:t>
+        <w:t xml:space="preserve">  ·  56 checks</w:t>
       </w:r>
     </w:p>
     <w:tbl>
@@ -14560,6 +14560,1160 @@
                 <w:szCs w:val="19"/>
               </w:rPr>
               <w:t xml:space="preserve">The member's name, mobile and email fill in. The sale shows the member in the Sales list; a blocked member cannot be tagged.</w:t>
+            </w:r>
+          </w:p>
+        </w:tc>
+        <w:tc>
+          <w:tcPr>
+            <w:tcW w:type="dxa" w:w="620"/>
+            <w:tcBorders>
+              <w:top w:val="single" w:color="C9D0DC" w:sz="4"/>
+              <w:left w:val="single" w:color="C9D0DC" w:sz="4"/>
+              <w:bottom w:val="single" w:color="C9D0DC" w:sz="4"/>
+              <w:right w:val="single" w:color="C9D0DC" w:sz="4"/>
+            </w:tcBorders>
+            <w:tcMar>
+              <w:top w:type="dxa" w:w="70"/>
+              <w:left w:type="dxa" w:w="100"/>
+              <w:bottom w:type="dxa" w:w="70"/>
+              <w:right w:type="dxa" w:w="100"/>
+            </w:tcMar>
+            <w:vAlign w:val="center"/>
+          </w:tcPr>
+          <w:p>
+            <w:pPr>
+              <w:spacing w:after="0" w:before="0" w:line="264"/>
+              <w:jc w:val="center"/>
+            </w:pPr>
+            <w:r>
+              <w:rPr>
+                <w:rFonts w:ascii="Arial" w:cs="Arial" w:eastAsia="Arial" w:hAnsi="Arial"/>
+                <w:sz w:val="30"/>
+                <w:szCs w:val="30"/>
+              </w:rPr>
+              <w:t xml:space="preserve">☐</w:t>
+            </w:r>
+          </w:p>
+        </w:tc>
+        <w:tc>
+          <w:tcPr>
+            <w:tcW w:type="dxa" w:w="620"/>
+            <w:tcBorders>
+              <w:top w:val="single" w:color="C9D0DC" w:sz="4"/>
+              <w:left w:val="single" w:color="C9D0DC" w:sz="4"/>
+              <w:bottom w:val="single" w:color="C9D0DC" w:sz="4"/>
+              <w:right w:val="single" w:color="C9D0DC" w:sz="4"/>
+            </w:tcBorders>
+            <w:tcMar>
+              <w:top w:type="dxa" w:w="70"/>
+              <w:left w:type="dxa" w:w="100"/>
+              <w:bottom w:type="dxa" w:w="70"/>
+              <w:right w:type="dxa" w:w="100"/>
+            </w:tcMar>
+            <w:vAlign w:val="center"/>
+          </w:tcPr>
+          <w:p>
+            <w:pPr>
+              <w:spacing w:after="0" w:before="0" w:line="264"/>
+              <w:jc w:val="center"/>
+            </w:pPr>
+            <w:r>
+              <w:rPr>
+                <w:rFonts w:ascii="Arial" w:cs="Arial" w:eastAsia="Arial" w:hAnsi="Arial"/>
+                <w:sz w:val="30"/>
+                <w:szCs w:val="30"/>
+              </w:rPr>
+              <w:t xml:space="preserve">☐</w:t>
+            </w:r>
+          </w:p>
+        </w:tc>
+        <w:tc>
+          <w:tcPr>
+            <w:tcW w:type="dxa" w:w="620"/>
+            <w:tcBorders>
+              <w:top w:val="single" w:color="C9D0DC" w:sz="4"/>
+              <w:left w:val="single" w:color="C9D0DC" w:sz="4"/>
+              <w:bottom w:val="single" w:color="C9D0DC" w:sz="4"/>
+              <w:right w:val="single" w:color="C9D0DC" w:sz="4"/>
+            </w:tcBorders>
+            <w:tcMar>
+              <w:top w:type="dxa" w:w="70"/>
+              <w:left w:type="dxa" w:w="100"/>
+              <w:bottom w:type="dxa" w:w="70"/>
+              <w:right w:type="dxa" w:w="100"/>
+            </w:tcMar>
+            <w:vAlign w:val="center"/>
+          </w:tcPr>
+          <w:p>
+            <w:pPr>
+              <w:spacing w:after="0" w:before="0" w:line="264"/>
+              <w:jc w:val="center"/>
+            </w:pPr>
+            <w:r>
+              <w:rPr>
+                <w:rFonts w:ascii="Arial" w:cs="Arial" w:eastAsia="Arial" w:hAnsi="Arial"/>
+                <w:sz w:val="30"/>
+                <w:szCs w:val="30"/>
+              </w:rPr>
+              <w:t xml:space="preserve">☐</w:t>
+            </w:r>
+          </w:p>
+        </w:tc>
+        <w:tc>
+          <w:tcPr>
+            <w:tcW w:type="dxa" w:w="2040"/>
+            <w:tcBorders>
+              <w:top w:val="single" w:color="C9D0DC" w:sz="4"/>
+              <w:left w:val="single" w:color="C9D0DC" w:sz="4"/>
+              <w:bottom w:val="single" w:color="C9D0DC" w:sz="4"/>
+              <w:right w:val="single" w:color="C9D0DC" w:sz="4"/>
+            </w:tcBorders>
+            <w:tcMar>
+              <w:top w:type="dxa" w:w="70"/>
+              <w:left w:type="dxa" w:w="100"/>
+              <w:bottom w:type="dxa" w:w="70"/>
+              <w:right w:type="dxa" w:w="100"/>
+            </w:tcMar>
+            <w:vAlign w:val="top"/>
+          </w:tcPr>
+          <w:p>
+            <w:pPr>
+              <w:spacing w:after="0" w:before="0" w:line="264"/>
+            </w:pPr>
+            <w:r>
+              <w:rPr>
+                <w:rFonts w:ascii="Arial" w:cs="Arial" w:eastAsia="Arial" w:hAnsi="Arial"/>
+                <w:sz w:val="19"/>
+                <w:szCs w:val="19"/>
+              </w:rPr>
+              <w:t xml:space="preserve"> </w:t>
+            </w:r>
+          </w:p>
+        </w:tc>
+      </w:tr>
+      <w:tr>
+        <w:trPr>
+          <w:cantSplit/>
+        </w:trPr>
+        <w:tc>
+          <w:tcPr>
+            <w:tcW w:type="dxa" w:w="860"/>
+            <w:tcBorders>
+              <w:top w:val="single" w:color="C9D0DC" w:sz="4"/>
+              <w:left w:val="single" w:color="C9D0DC" w:sz="4"/>
+              <w:bottom w:val="single" w:color="C9D0DC" w:sz="4"/>
+              <w:right w:val="single" w:color="C9D0DC" w:sz="4"/>
+            </w:tcBorders>
+            <w:tcMar>
+              <w:top w:type="dxa" w:w="70"/>
+              <w:left w:type="dxa" w:w="100"/>
+              <w:bottom w:type="dxa" w:w="70"/>
+              <w:right w:type="dxa" w:w="100"/>
+            </w:tcMar>
+            <w:vAlign w:val="top"/>
+          </w:tcPr>
+          <w:p>
+            <w:pPr>
+              <w:spacing w:after="0" w:before="0" w:line="264"/>
+            </w:pPr>
+            <w:r>
+              <w:rPr>
+                <w:rFonts w:ascii="Arial" w:cs="Arial" w:eastAsia="Arial" w:hAnsi="Arial"/>
+                <w:b/>
+                <w:bCs/>
+                <w:color w:val="5B6477"/>
+                <w:sz w:val="16"/>
+                <w:szCs w:val="16"/>
+              </w:rPr>
+              <w:t xml:space="preserve">SA-49</w:t>
+            </w:r>
+          </w:p>
+        </w:tc>
+        <w:tc>
+          <w:tcPr>
+            <w:tcW w:type="dxa" w:w="5480"/>
+            <w:tcBorders>
+              <w:top w:val="single" w:color="C9D0DC" w:sz="4"/>
+              <w:left w:val="single" w:color="C9D0DC" w:sz="4"/>
+              <w:bottom w:val="single" w:color="C9D0DC" w:sz="4"/>
+              <w:right w:val="single" w:color="C9D0DC" w:sz="4"/>
+            </w:tcBorders>
+            <w:tcMar>
+              <w:top w:type="dxa" w:w="70"/>
+              <w:left w:type="dxa" w:w="100"/>
+              <w:bottom w:type="dxa" w:w="70"/>
+              <w:right w:type="dxa" w:w="100"/>
+            </w:tcMar>
+            <w:vAlign w:val="top"/>
+          </w:tcPr>
+          <w:p>
+            <w:pPr>
+              <w:spacing w:after="40" w:before="0" w:line="264"/>
+            </w:pPr>
+            <w:r>
+              <w:rPr>
+                <w:rFonts w:ascii="Arial" w:cs="Arial" w:eastAsia="Arial" w:hAnsi="Arial"/>
+                <w:b/>
+                <w:bCs/>
+                <w:sz w:val="20"/>
+                <w:szCs w:val="20"/>
+              </w:rPr>
+              <w:t xml:space="preserve">Use a member voucher and see the member</w:t>
+            </w:r>
+          </w:p>
+          <w:p>
+            <w:pPr>
+              <w:spacing w:after="40" w:before="0" w:line="264"/>
+            </w:pPr>
+            <w:r>
+              <w:rPr>
+                <w:rFonts w:ascii="Arial" w:cs="Arial" w:eastAsia="Arial" w:hAnsi="Arial"/>
+                <w:i/>
+                <w:iCs/>
+                <w:color w:val="5B6477"/>
+                <w:sz w:val="15"/>
+                <w:szCs w:val="15"/>
+              </w:rPr>
+              <w:t xml:space="preserve">Flow F33 · Member program: vouchers, member prices, lost sales, insights and chat campaigns</w:t>
+            </w:r>
+          </w:p>
+          <w:p>
+            <w:pPr>
+              <w:spacing w:after="20" w:before="0" w:line="264"/>
+            </w:pPr>
+            <w:r>
+              <w:rPr>
+                <w:rFonts w:ascii="Arial" w:cs="Arial" w:eastAsia="Arial" w:hAnsi="Arial"/>
+                <w:color w:val="5B6477"/>
+                <w:sz w:val="19"/>
+                <w:szCs w:val="19"/>
+              </w:rPr>
+              <w:t xml:space="preserve">1.  </w:t>
+            </w:r>
+            <w:r>
+              <w:rPr>
+                <w:rFonts w:ascii="Arial" w:cs="Arial" w:eastAsia="Arial" w:hAnsi="Arial"/>
+                <w:sz w:val="19"/>
+                <w:szCs w:val="19"/>
+              </w:rPr>
+              <w:t xml:space="preserve">New Sale → Wheysted member: pick a member who has a voucher (the Sales Manager gives one under Wheysted Members).</w:t>
+            </w:r>
+          </w:p>
+          <w:p>
+            <w:pPr>
+              <w:spacing w:after="20" w:before="0" w:line="264"/>
+            </w:pPr>
+            <w:r>
+              <w:rPr>
+                <w:rFonts w:ascii="Arial" w:cs="Arial" w:eastAsia="Arial" w:hAnsi="Arial"/>
+                <w:color w:val="5B6477"/>
+                <w:sz w:val="19"/>
+                <w:szCs w:val="19"/>
+              </w:rPr>
+              <w:t xml:space="preserve">2.  </w:t>
+            </w:r>
+            <w:r>
+              <w:rPr>
+                <w:rFonts w:ascii="Arial" w:cs="Arial" w:eastAsia="Arial" w:hAnsi="Arial"/>
+                <w:sz w:val="19"/>
+                <w:szCs w:val="19"/>
+              </w:rPr>
+              <w:t xml:space="preserve">Read the tier, points, vouchers and what they usually buy.</w:t>
+            </w:r>
+          </w:p>
+          <w:p>
+            <w:pPr>
+              <w:spacing w:after="20" w:before="0" w:line="264"/>
+            </w:pPr>
+            <w:r>
+              <w:rPr>
+                <w:rFonts w:ascii="Arial" w:cs="Arial" w:eastAsia="Arial" w:hAnsi="Arial"/>
+                <w:color w:val="5B6477"/>
+                <w:sz w:val="19"/>
+                <w:szCs w:val="19"/>
+              </w:rPr>
+              <w:t xml:space="preserve">3.  </w:t>
+            </w:r>
+            <w:r>
+              <w:rPr>
+                <w:rFonts w:ascii="Arial" w:cs="Arial" w:eastAsia="Arial" w:hAnsi="Arial"/>
+                <w:sz w:val="19"/>
+                <w:szCs w:val="19"/>
+              </w:rPr>
+              <w:t xml:space="preserve">Tap the voucher, add a supplement, Review sale → Save.</w:t>
+            </w:r>
+          </w:p>
+          <w:p>
+            <w:pPr>
+              <w:spacing w:after="0" w:before="60" w:line="264"/>
+            </w:pPr>
+            <w:r>
+              <w:rPr>
+                <w:rFonts w:ascii="Arial" w:cs="Arial" w:eastAsia="Arial" w:hAnsi="Arial"/>
+                <w:b/>
+                <w:bCs/>
+                <w:color w:val="0B1F3A"/>
+                <w:sz w:val="19"/>
+                <w:szCs w:val="19"/>
+              </w:rPr>
+              <w:t xml:space="preserve">You should see: </w:t>
+            </w:r>
+            <w:r>
+              <w:rPr>
+                <w:rFonts w:ascii="Arial" w:cs="Arial" w:eastAsia="Arial" w:hAnsi="Arial"/>
+                <w:sz w:val="19"/>
+                <w:szCs w:val="19"/>
+              </w:rPr>
+              <w:t xml:space="preserve">The voucher takes its value off the supplements only. The same voucher cannot be used again, and a voucher of another member is refused. A void gives the voucher back.</w:t>
+            </w:r>
+          </w:p>
+        </w:tc>
+        <w:tc>
+          <w:tcPr>
+            <w:tcW w:type="dxa" w:w="620"/>
+            <w:tcBorders>
+              <w:top w:val="single" w:color="C9D0DC" w:sz="4"/>
+              <w:left w:val="single" w:color="C9D0DC" w:sz="4"/>
+              <w:bottom w:val="single" w:color="C9D0DC" w:sz="4"/>
+              <w:right w:val="single" w:color="C9D0DC" w:sz="4"/>
+            </w:tcBorders>
+            <w:tcMar>
+              <w:top w:type="dxa" w:w="70"/>
+              <w:left w:type="dxa" w:w="100"/>
+              <w:bottom w:type="dxa" w:w="70"/>
+              <w:right w:type="dxa" w:w="100"/>
+            </w:tcMar>
+            <w:vAlign w:val="center"/>
+          </w:tcPr>
+          <w:p>
+            <w:pPr>
+              <w:spacing w:after="0" w:before="0" w:line="264"/>
+              <w:jc w:val="center"/>
+            </w:pPr>
+            <w:r>
+              <w:rPr>
+                <w:rFonts w:ascii="Arial" w:cs="Arial" w:eastAsia="Arial" w:hAnsi="Arial"/>
+                <w:sz w:val="30"/>
+                <w:szCs w:val="30"/>
+              </w:rPr>
+              <w:t xml:space="preserve">☐</w:t>
+            </w:r>
+          </w:p>
+        </w:tc>
+        <w:tc>
+          <w:tcPr>
+            <w:tcW w:type="dxa" w:w="620"/>
+            <w:tcBorders>
+              <w:top w:val="single" w:color="C9D0DC" w:sz="4"/>
+              <w:left w:val="single" w:color="C9D0DC" w:sz="4"/>
+              <w:bottom w:val="single" w:color="C9D0DC" w:sz="4"/>
+              <w:right w:val="single" w:color="C9D0DC" w:sz="4"/>
+            </w:tcBorders>
+            <w:tcMar>
+              <w:top w:type="dxa" w:w="70"/>
+              <w:left w:type="dxa" w:w="100"/>
+              <w:bottom w:type="dxa" w:w="70"/>
+              <w:right w:type="dxa" w:w="100"/>
+            </w:tcMar>
+            <w:vAlign w:val="center"/>
+          </w:tcPr>
+          <w:p>
+            <w:pPr>
+              <w:spacing w:after="0" w:before="0" w:line="264"/>
+              <w:jc w:val="center"/>
+            </w:pPr>
+            <w:r>
+              <w:rPr>
+                <w:rFonts w:ascii="Arial" w:cs="Arial" w:eastAsia="Arial" w:hAnsi="Arial"/>
+                <w:sz w:val="30"/>
+                <w:szCs w:val="30"/>
+              </w:rPr>
+              <w:t xml:space="preserve">☐</w:t>
+            </w:r>
+          </w:p>
+        </w:tc>
+        <w:tc>
+          <w:tcPr>
+            <w:tcW w:type="dxa" w:w="620"/>
+            <w:tcBorders>
+              <w:top w:val="single" w:color="C9D0DC" w:sz="4"/>
+              <w:left w:val="single" w:color="C9D0DC" w:sz="4"/>
+              <w:bottom w:val="single" w:color="C9D0DC" w:sz="4"/>
+              <w:right w:val="single" w:color="C9D0DC" w:sz="4"/>
+            </w:tcBorders>
+            <w:tcMar>
+              <w:top w:type="dxa" w:w="70"/>
+              <w:left w:type="dxa" w:w="100"/>
+              <w:bottom w:type="dxa" w:w="70"/>
+              <w:right w:type="dxa" w:w="100"/>
+            </w:tcMar>
+            <w:vAlign w:val="center"/>
+          </w:tcPr>
+          <w:p>
+            <w:pPr>
+              <w:spacing w:after="0" w:before="0" w:line="264"/>
+              <w:jc w:val="center"/>
+            </w:pPr>
+            <w:r>
+              <w:rPr>
+                <w:rFonts w:ascii="Arial" w:cs="Arial" w:eastAsia="Arial" w:hAnsi="Arial"/>
+                <w:sz w:val="30"/>
+                <w:szCs w:val="30"/>
+              </w:rPr>
+              <w:t xml:space="preserve">☐</w:t>
+            </w:r>
+          </w:p>
+        </w:tc>
+        <w:tc>
+          <w:tcPr>
+            <w:tcW w:type="dxa" w:w="2040"/>
+            <w:tcBorders>
+              <w:top w:val="single" w:color="C9D0DC" w:sz="4"/>
+              <w:left w:val="single" w:color="C9D0DC" w:sz="4"/>
+              <w:bottom w:val="single" w:color="C9D0DC" w:sz="4"/>
+              <w:right w:val="single" w:color="C9D0DC" w:sz="4"/>
+            </w:tcBorders>
+            <w:tcMar>
+              <w:top w:type="dxa" w:w="70"/>
+              <w:left w:type="dxa" w:w="100"/>
+              <w:bottom w:type="dxa" w:w="70"/>
+              <w:right w:type="dxa" w:w="100"/>
+            </w:tcMar>
+            <w:vAlign w:val="top"/>
+          </w:tcPr>
+          <w:p>
+            <w:pPr>
+              <w:spacing w:after="0" w:before="0" w:line="264"/>
+            </w:pPr>
+            <w:r>
+              <w:rPr>
+                <w:rFonts w:ascii="Arial" w:cs="Arial" w:eastAsia="Arial" w:hAnsi="Arial"/>
+                <w:sz w:val="19"/>
+                <w:szCs w:val="19"/>
+              </w:rPr>
+              <w:t xml:space="preserve"> </w:t>
+            </w:r>
+          </w:p>
+        </w:tc>
+      </w:tr>
+      <w:tr>
+        <w:trPr>
+          <w:cantSplit/>
+        </w:trPr>
+        <w:tc>
+          <w:tcPr>
+            <w:tcW w:type="dxa" w:w="860"/>
+            <w:tcBorders>
+              <w:top w:val="single" w:color="C9D0DC" w:sz="4"/>
+              <w:left w:val="single" w:color="C9D0DC" w:sz="4"/>
+              <w:bottom w:val="single" w:color="C9D0DC" w:sz="4"/>
+              <w:right w:val="single" w:color="C9D0DC" w:sz="4"/>
+            </w:tcBorders>
+            <w:tcMar>
+              <w:top w:type="dxa" w:w="70"/>
+              <w:left w:type="dxa" w:w="100"/>
+              <w:bottom w:type="dxa" w:w="70"/>
+              <w:right w:type="dxa" w:w="100"/>
+            </w:tcMar>
+            <w:vAlign w:val="top"/>
+          </w:tcPr>
+          <w:p>
+            <w:pPr>
+              <w:spacing w:after="0" w:before="0" w:line="264"/>
+            </w:pPr>
+            <w:r>
+              <w:rPr>
+                <w:rFonts w:ascii="Arial" w:cs="Arial" w:eastAsia="Arial" w:hAnsi="Arial"/>
+                <w:b/>
+                <w:bCs/>
+                <w:color w:val="5B6477"/>
+                <w:sz w:val="16"/>
+                <w:szCs w:val="16"/>
+              </w:rPr>
+              <w:t xml:space="preserve">SA-50</w:t>
+            </w:r>
+          </w:p>
+        </w:tc>
+        <w:tc>
+          <w:tcPr>
+            <w:tcW w:type="dxa" w:w="5480"/>
+            <w:tcBorders>
+              <w:top w:val="single" w:color="C9D0DC" w:sz="4"/>
+              <w:left w:val="single" w:color="C9D0DC" w:sz="4"/>
+              <w:bottom w:val="single" w:color="C9D0DC" w:sz="4"/>
+              <w:right w:val="single" w:color="C9D0DC" w:sz="4"/>
+            </w:tcBorders>
+            <w:tcMar>
+              <w:top w:type="dxa" w:w="70"/>
+              <w:left w:type="dxa" w:w="100"/>
+              <w:bottom w:type="dxa" w:w="70"/>
+              <w:right w:type="dxa" w:w="100"/>
+            </w:tcMar>
+            <w:vAlign w:val="top"/>
+          </w:tcPr>
+          <w:p>
+            <w:pPr>
+              <w:spacing w:after="40" w:before="0" w:line="264"/>
+            </w:pPr>
+            <w:r>
+              <w:rPr>
+                <w:rFonts w:ascii="Arial" w:cs="Arial" w:eastAsia="Arial" w:hAnsi="Arial"/>
+                <w:b/>
+                <w:bCs/>
+                <w:sz w:val="20"/>
+                <w:szCs w:val="20"/>
+              </w:rPr>
+              <w:t xml:space="preserve">Member price</w:t>
+            </w:r>
+          </w:p>
+          <w:p>
+            <w:pPr>
+              <w:spacing w:after="40" w:before="0" w:line="264"/>
+            </w:pPr>
+            <w:r>
+              <w:rPr>
+                <w:rFonts w:ascii="Arial" w:cs="Arial" w:eastAsia="Arial" w:hAnsi="Arial"/>
+                <w:i/>
+                <w:iCs/>
+                <w:color w:val="5B6477"/>
+                <w:sz w:val="15"/>
+                <w:szCs w:val="15"/>
+              </w:rPr>
+              <w:t xml:space="preserve">Flow F33 · Member program: vouchers, member prices, lost sales, insights and chat campaigns</w:t>
+            </w:r>
+          </w:p>
+          <w:p>
+            <w:pPr>
+              <w:spacing w:after="20" w:before="0" w:line="264"/>
+            </w:pPr>
+            <w:r>
+              <w:rPr>
+                <w:rFonts w:ascii="Arial" w:cs="Arial" w:eastAsia="Arial" w:hAnsi="Arial"/>
+                <w:color w:val="5B6477"/>
+                <w:sz w:val="19"/>
+                <w:szCs w:val="19"/>
+              </w:rPr>
+              <w:t xml:space="preserve">1.  </w:t>
+            </w:r>
+            <w:r>
+              <w:rPr>
+                <w:rFonts w:ascii="Arial" w:cs="Arial" w:eastAsia="Arial" w:hAnsi="Arial"/>
+                <w:sz w:val="19"/>
+                <w:szCs w:val="19"/>
+              </w:rPr>
+              <w:t xml:space="preserve">With a member picked, add an item that has a member price (Wheysted Members → Member prices) without typing a price.</w:t>
+            </w:r>
+          </w:p>
+          <w:p>
+            <w:pPr>
+              <w:spacing w:after="20" w:before="0" w:line="264"/>
+            </w:pPr>
+            <w:r>
+              <w:rPr>
+                <w:rFonts w:ascii="Arial" w:cs="Arial" w:eastAsia="Arial" w:hAnsi="Arial"/>
+                <w:color w:val="5B6477"/>
+                <w:sz w:val="19"/>
+                <w:szCs w:val="19"/>
+              </w:rPr>
+              <w:t xml:space="preserve">2.  </w:t>
+            </w:r>
+            <w:r>
+              <w:rPr>
+                <w:rFonts w:ascii="Arial" w:cs="Arial" w:eastAsia="Arial" w:hAnsi="Arial"/>
+                <w:sz w:val="19"/>
+                <w:szCs w:val="19"/>
+              </w:rPr>
+              <w:t xml:space="preserve">Sell the same item to a walk-in.</w:t>
+            </w:r>
+          </w:p>
+          <w:p>
+            <w:pPr>
+              <w:spacing w:after="0" w:before="60" w:line="264"/>
+            </w:pPr>
+            <w:r>
+              <w:rPr>
+                <w:rFonts w:ascii="Arial" w:cs="Arial" w:eastAsia="Arial" w:hAnsi="Arial"/>
+                <w:b/>
+                <w:bCs/>
+                <w:color w:val="0B1F3A"/>
+                <w:sz w:val="19"/>
+                <w:szCs w:val="19"/>
+              </w:rPr>
+              <w:t xml:space="preserve">You should see: </w:t>
+            </w:r>
+            <w:r>
+              <w:rPr>
+                <w:rFonts w:ascii="Arial" w:cs="Arial" w:eastAsia="Arial" w:hAnsi="Arial"/>
+                <w:sz w:val="19"/>
+                <w:szCs w:val="19"/>
+              </w:rPr>
+              <w:t xml:space="preserve">The member gets the member price at once (no special-price approval). The walk-in pays the normal price.</w:t>
+            </w:r>
+          </w:p>
+        </w:tc>
+        <w:tc>
+          <w:tcPr>
+            <w:tcW w:type="dxa" w:w="620"/>
+            <w:tcBorders>
+              <w:top w:val="single" w:color="C9D0DC" w:sz="4"/>
+              <w:left w:val="single" w:color="C9D0DC" w:sz="4"/>
+              <w:bottom w:val="single" w:color="C9D0DC" w:sz="4"/>
+              <w:right w:val="single" w:color="C9D0DC" w:sz="4"/>
+            </w:tcBorders>
+            <w:tcMar>
+              <w:top w:type="dxa" w:w="70"/>
+              <w:left w:type="dxa" w:w="100"/>
+              <w:bottom w:type="dxa" w:w="70"/>
+              <w:right w:type="dxa" w:w="100"/>
+            </w:tcMar>
+            <w:vAlign w:val="center"/>
+          </w:tcPr>
+          <w:p>
+            <w:pPr>
+              <w:spacing w:after="0" w:before="0" w:line="264"/>
+              <w:jc w:val="center"/>
+            </w:pPr>
+            <w:r>
+              <w:rPr>
+                <w:rFonts w:ascii="Arial" w:cs="Arial" w:eastAsia="Arial" w:hAnsi="Arial"/>
+                <w:sz w:val="30"/>
+                <w:szCs w:val="30"/>
+              </w:rPr>
+              <w:t xml:space="preserve">☐</w:t>
+            </w:r>
+          </w:p>
+        </w:tc>
+        <w:tc>
+          <w:tcPr>
+            <w:tcW w:type="dxa" w:w="620"/>
+            <w:tcBorders>
+              <w:top w:val="single" w:color="C9D0DC" w:sz="4"/>
+              <w:left w:val="single" w:color="C9D0DC" w:sz="4"/>
+              <w:bottom w:val="single" w:color="C9D0DC" w:sz="4"/>
+              <w:right w:val="single" w:color="C9D0DC" w:sz="4"/>
+            </w:tcBorders>
+            <w:tcMar>
+              <w:top w:type="dxa" w:w="70"/>
+              <w:left w:type="dxa" w:w="100"/>
+              <w:bottom w:type="dxa" w:w="70"/>
+              <w:right w:type="dxa" w:w="100"/>
+            </w:tcMar>
+            <w:vAlign w:val="center"/>
+          </w:tcPr>
+          <w:p>
+            <w:pPr>
+              <w:spacing w:after="0" w:before="0" w:line="264"/>
+              <w:jc w:val="center"/>
+            </w:pPr>
+            <w:r>
+              <w:rPr>
+                <w:rFonts w:ascii="Arial" w:cs="Arial" w:eastAsia="Arial" w:hAnsi="Arial"/>
+                <w:sz w:val="30"/>
+                <w:szCs w:val="30"/>
+              </w:rPr>
+              <w:t xml:space="preserve">☐</w:t>
+            </w:r>
+          </w:p>
+        </w:tc>
+        <w:tc>
+          <w:tcPr>
+            <w:tcW w:type="dxa" w:w="620"/>
+            <w:tcBorders>
+              <w:top w:val="single" w:color="C9D0DC" w:sz="4"/>
+              <w:left w:val="single" w:color="C9D0DC" w:sz="4"/>
+              <w:bottom w:val="single" w:color="C9D0DC" w:sz="4"/>
+              <w:right w:val="single" w:color="C9D0DC" w:sz="4"/>
+            </w:tcBorders>
+            <w:tcMar>
+              <w:top w:type="dxa" w:w="70"/>
+              <w:left w:type="dxa" w:w="100"/>
+              <w:bottom w:type="dxa" w:w="70"/>
+              <w:right w:type="dxa" w:w="100"/>
+            </w:tcMar>
+            <w:vAlign w:val="center"/>
+          </w:tcPr>
+          <w:p>
+            <w:pPr>
+              <w:spacing w:after="0" w:before="0" w:line="264"/>
+              <w:jc w:val="center"/>
+            </w:pPr>
+            <w:r>
+              <w:rPr>
+                <w:rFonts w:ascii="Arial" w:cs="Arial" w:eastAsia="Arial" w:hAnsi="Arial"/>
+                <w:sz w:val="30"/>
+                <w:szCs w:val="30"/>
+              </w:rPr>
+              <w:t xml:space="preserve">☐</w:t>
+            </w:r>
+          </w:p>
+        </w:tc>
+        <w:tc>
+          <w:tcPr>
+            <w:tcW w:type="dxa" w:w="2040"/>
+            <w:tcBorders>
+              <w:top w:val="single" w:color="C9D0DC" w:sz="4"/>
+              <w:left w:val="single" w:color="C9D0DC" w:sz="4"/>
+              <w:bottom w:val="single" w:color="C9D0DC" w:sz="4"/>
+              <w:right w:val="single" w:color="C9D0DC" w:sz="4"/>
+            </w:tcBorders>
+            <w:tcMar>
+              <w:top w:type="dxa" w:w="70"/>
+              <w:left w:type="dxa" w:w="100"/>
+              <w:bottom w:type="dxa" w:w="70"/>
+              <w:right w:type="dxa" w:w="100"/>
+            </w:tcMar>
+            <w:vAlign w:val="top"/>
+          </w:tcPr>
+          <w:p>
+            <w:pPr>
+              <w:spacing w:after="0" w:before="0" w:line="264"/>
+            </w:pPr>
+            <w:r>
+              <w:rPr>
+                <w:rFonts w:ascii="Arial" w:cs="Arial" w:eastAsia="Arial" w:hAnsi="Arial"/>
+                <w:sz w:val="19"/>
+                <w:szCs w:val="19"/>
+              </w:rPr>
+              <w:t xml:space="preserve"> </w:t>
+            </w:r>
+          </w:p>
+        </w:tc>
+      </w:tr>
+      <w:tr>
+        <w:trPr>
+          <w:cantSplit/>
+        </w:trPr>
+        <w:tc>
+          <w:tcPr>
+            <w:tcW w:type="dxa" w:w="860"/>
+            <w:tcBorders>
+              <w:top w:val="single" w:color="C9D0DC" w:sz="4"/>
+              <w:left w:val="single" w:color="C9D0DC" w:sz="4"/>
+              <w:bottom w:val="single" w:color="C9D0DC" w:sz="4"/>
+              <w:right w:val="single" w:color="C9D0DC" w:sz="4"/>
+            </w:tcBorders>
+            <w:tcMar>
+              <w:top w:type="dxa" w:w="70"/>
+              <w:left w:type="dxa" w:w="100"/>
+              <w:bottom w:type="dxa" w:w="70"/>
+              <w:right w:type="dxa" w:w="100"/>
+            </w:tcMar>
+            <w:vAlign w:val="top"/>
+          </w:tcPr>
+          <w:p>
+            <w:pPr>
+              <w:spacing w:after="0" w:before="0" w:line="264"/>
+            </w:pPr>
+            <w:r>
+              <w:rPr>
+                <w:rFonts w:ascii="Arial" w:cs="Arial" w:eastAsia="Arial" w:hAnsi="Arial"/>
+                <w:b/>
+                <w:bCs/>
+                <w:color w:val="5B6477"/>
+                <w:sz w:val="16"/>
+                <w:szCs w:val="16"/>
+              </w:rPr>
+              <w:t xml:space="preserve">SA-51</w:t>
+            </w:r>
+          </w:p>
+        </w:tc>
+        <w:tc>
+          <w:tcPr>
+            <w:tcW w:type="dxa" w:w="5480"/>
+            <w:tcBorders>
+              <w:top w:val="single" w:color="C9D0DC" w:sz="4"/>
+              <w:left w:val="single" w:color="C9D0DC" w:sz="4"/>
+              <w:bottom w:val="single" w:color="C9D0DC" w:sz="4"/>
+              <w:right w:val="single" w:color="C9D0DC" w:sz="4"/>
+            </w:tcBorders>
+            <w:tcMar>
+              <w:top w:type="dxa" w:w="70"/>
+              <w:left w:type="dxa" w:w="100"/>
+              <w:bottom w:type="dxa" w:w="70"/>
+              <w:right w:type="dxa" w:w="100"/>
+            </w:tcMar>
+            <w:vAlign w:val="top"/>
+          </w:tcPr>
+          <w:p>
+            <w:pPr>
+              <w:spacing w:after="40" w:before="0" w:line="264"/>
+            </w:pPr>
+            <w:r>
+              <w:rPr>
+                <w:rFonts w:ascii="Arial" w:cs="Arial" w:eastAsia="Arial" w:hAnsi="Arial"/>
+                <w:b/>
+                <w:bCs/>
+                <w:sz w:val="20"/>
+                <w:szCs w:val="20"/>
+              </w:rPr>
+              <w:t xml:space="preserve">Log an item we did not have</w:t>
+            </w:r>
+          </w:p>
+          <w:p>
+            <w:pPr>
+              <w:spacing w:after="40" w:before="0" w:line="264"/>
+            </w:pPr>
+            <w:r>
+              <w:rPr>
+                <w:rFonts w:ascii="Arial" w:cs="Arial" w:eastAsia="Arial" w:hAnsi="Arial"/>
+                <w:i/>
+                <w:iCs/>
+                <w:color w:val="5B6477"/>
+                <w:sz w:val="15"/>
+                <w:szCs w:val="15"/>
+              </w:rPr>
+              <w:t xml:space="preserve">Flow F33 · Member program: vouchers, member prices, lost sales, insights and chat campaigns</w:t>
+            </w:r>
+          </w:p>
+          <w:p>
+            <w:pPr>
+              <w:spacing w:after="20" w:before="0" w:line="264"/>
+            </w:pPr>
+            <w:r>
+              <w:rPr>
+                <w:rFonts w:ascii="Arial" w:cs="Arial" w:eastAsia="Arial" w:hAnsi="Arial"/>
+                <w:color w:val="5B6477"/>
+                <w:sz w:val="19"/>
+                <w:szCs w:val="19"/>
+              </w:rPr>
+              <w:t xml:space="preserve">1.  </w:t>
+            </w:r>
+            <w:r>
+              <w:rPr>
+                <w:rFonts w:ascii="Arial" w:cs="Arial" w:eastAsia="Arial" w:hAnsi="Arial"/>
+                <w:sz w:val="19"/>
+                <w:szCs w:val="19"/>
+              </w:rPr>
+              <w:t xml:space="preserve">New Sale → Customer asked for an item we didn't have.</w:t>
+            </w:r>
+          </w:p>
+          <w:p>
+            <w:pPr>
+              <w:spacing w:after="20" w:before="0" w:line="264"/>
+            </w:pPr>
+            <w:r>
+              <w:rPr>
+                <w:rFonts w:ascii="Arial" w:cs="Arial" w:eastAsia="Arial" w:hAnsi="Arial"/>
+                <w:color w:val="5B6477"/>
+                <w:sz w:val="19"/>
+                <w:szCs w:val="19"/>
+              </w:rPr>
+              <w:t xml:space="preserve">2.  </w:t>
+            </w:r>
+            <w:r>
+              <w:rPr>
+                <w:rFonts w:ascii="Arial" w:cs="Arial" w:eastAsia="Arial" w:hAnsi="Arial"/>
+                <w:sz w:val="19"/>
+                <w:szCs w:val="19"/>
+              </w:rPr>
+              <w:t xml:space="preserve">Pick or type the item, the quantity → Save.</w:t>
+            </w:r>
+          </w:p>
+          <w:p>
+            <w:pPr>
+              <w:spacing w:after="0" w:before="60" w:line="264"/>
+            </w:pPr>
+            <w:r>
+              <w:rPr>
+                <w:rFonts w:ascii="Arial" w:cs="Arial" w:eastAsia="Arial" w:hAnsi="Arial"/>
+                <w:b/>
+                <w:bCs/>
+                <w:color w:val="0B1F3A"/>
+                <w:sz w:val="19"/>
+                <w:szCs w:val="19"/>
+              </w:rPr>
+              <w:t xml:space="preserve">You should see: </w:t>
+            </w:r>
+            <w:r>
+              <w:rPr>
+                <w:rFonts w:ascii="Arial" w:cs="Arial" w:eastAsia="Arial" w:hAnsi="Arial"/>
+                <w:sz w:val="19"/>
+                <w:szCs w:val="19"/>
+              </w:rPr>
+              <w:t xml:space="preserve">It is saved and counted under Wheysted Members → Lost sales and in the Customers asked column of Days of stock.</w:t>
+            </w:r>
+          </w:p>
+        </w:tc>
+        <w:tc>
+          <w:tcPr>
+            <w:tcW w:type="dxa" w:w="620"/>
+            <w:tcBorders>
+              <w:top w:val="single" w:color="C9D0DC" w:sz="4"/>
+              <w:left w:val="single" w:color="C9D0DC" w:sz="4"/>
+              <w:bottom w:val="single" w:color="C9D0DC" w:sz="4"/>
+              <w:right w:val="single" w:color="C9D0DC" w:sz="4"/>
+            </w:tcBorders>
+            <w:tcMar>
+              <w:top w:type="dxa" w:w="70"/>
+              <w:left w:type="dxa" w:w="100"/>
+              <w:bottom w:type="dxa" w:w="70"/>
+              <w:right w:type="dxa" w:w="100"/>
+            </w:tcMar>
+            <w:vAlign w:val="center"/>
+          </w:tcPr>
+          <w:p>
+            <w:pPr>
+              <w:spacing w:after="0" w:before="0" w:line="264"/>
+              <w:jc w:val="center"/>
+            </w:pPr>
+            <w:r>
+              <w:rPr>
+                <w:rFonts w:ascii="Arial" w:cs="Arial" w:eastAsia="Arial" w:hAnsi="Arial"/>
+                <w:sz w:val="30"/>
+                <w:szCs w:val="30"/>
+              </w:rPr>
+              <w:t xml:space="preserve">☐</w:t>
+            </w:r>
+          </w:p>
+        </w:tc>
+        <w:tc>
+          <w:tcPr>
+            <w:tcW w:type="dxa" w:w="620"/>
+            <w:tcBorders>
+              <w:top w:val="single" w:color="C9D0DC" w:sz="4"/>
+              <w:left w:val="single" w:color="C9D0DC" w:sz="4"/>
+              <w:bottom w:val="single" w:color="C9D0DC" w:sz="4"/>
+              <w:right w:val="single" w:color="C9D0DC" w:sz="4"/>
+            </w:tcBorders>
+            <w:tcMar>
+              <w:top w:type="dxa" w:w="70"/>
+              <w:left w:type="dxa" w:w="100"/>
+              <w:bottom w:type="dxa" w:w="70"/>
+              <w:right w:type="dxa" w:w="100"/>
+            </w:tcMar>
+            <w:vAlign w:val="center"/>
+          </w:tcPr>
+          <w:p>
+            <w:pPr>
+              <w:spacing w:after="0" w:before="0" w:line="264"/>
+              <w:jc w:val="center"/>
+            </w:pPr>
+            <w:r>
+              <w:rPr>
+                <w:rFonts w:ascii="Arial" w:cs="Arial" w:eastAsia="Arial" w:hAnsi="Arial"/>
+                <w:sz w:val="30"/>
+                <w:szCs w:val="30"/>
+              </w:rPr>
+              <w:t xml:space="preserve">☐</w:t>
+            </w:r>
+          </w:p>
+        </w:tc>
+        <w:tc>
+          <w:tcPr>
+            <w:tcW w:type="dxa" w:w="620"/>
+            <w:tcBorders>
+              <w:top w:val="single" w:color="C9D0DC" w:sz="4"/>
+              <w:left w:val="single" w:color="C9D0DC" w:sz="4"/>
+              <w:bottom w:val="single" w:color="C9D0DC" w:sz="4"/>
+              <w:right w:val="single" w:color="C9D0DC" w:sz="4"/>
+            </w:tcBorders>
+            <w:tcMar>
+              <w:top w:type="dxa" w:w="70"/>
+              <w:left w:type="dxa" w:w="100"/>
+              <w:bottom w:type="dxa" w:w="70"/>
+              <w:right w:type="dxa" w:w="100"/>
+            </w:tcMar>
+            <w:vAlign w:val="center"/>
+          </w:tcPr>
+          <w:p>
+            <w:pPr>
+              <w:spacing w:after="0" w:before="0" w:line="264"/>
+              <w:jc w:val="center"/>
+            </w:pPr>
+            <w:r>
+              <w:rPr>
+                <w:rFonts w:ascii="Arial" w:cs="Arial" w:eastAsia="Arial" w:hAnsi="Arial"/>
+                <w:sz w:val="30"/>
+                <w:szCs w:val="30"/>
+              </w:rPr>
+              <w:t xml:space="preserve">☐</w:t>
+            </w:r>
+          </w:p>
+        </w:tc>
+        <w:tc>
+          <w:tcPr>
+            <w:tcW w:type="dxa" w:w="2040"/>
+            <w:tcBorders>
+              <w:top w:val="single" w:color="C9D0DC" w:sz="4"/>
+              <w:left w:val="single" w:color="C9D0DC" w:sz="4"/>
+              <w:bottom w:val="single" w:color="C9D0DC" w:sz="4"/>
+              <w:right w:val="single" w:color="C9D0DC" w:sz="4"/>
+            </w:tcBorders>
+            <w:tcMar>
+              <w:top w:type="dxa" w:w="70"/>
+              <w:left w:type="dxa" w:w="100"/>
+              <w:bottom w:type="dxa" w:w="70"/>
+              <w:right w:type="dxa" w:w="100"/>
+            </w:tcMar>
+            <w:vAlign w:val="top"/>
+          </w:tcPr>
+          <w:p>
+            <w:pPr>
+              <w:spacing w:after="0" w:before="0" w:line="264"/>
+            </w:pPr>
+            <w:r>
+              <w:rPr>
+                <w:rFonts w:ascii="Arial" w:cs="Arial" w:eastAsia="Arial" w:hAnsi="Arial"/>
+                <w:sz w:val="19"/>
+                <w:szCs w:val="19"/>
+              </w:rPr>
+              <w:t xml:space="preserve"> </w:t>
+            </w:r>
+          </w:p>
+        </w:tc>
+      </w:tr>
+      <w:tr>
+        <w:trPr>
+          <w:cantSplit/>
+        </w:trPr>
+        <w:tc>
+          <w:tcPr>
+            <w:tcW w:type="dxa" w:w="860"/>
+            <w:tcBorders>
+              <w:top w:val="single" w:color="C9D0DC" w:sz="4"/>
+              <w:left w:val="single" w:color="C9D0DC" w:sz="4"/>
+              <w:bottom w:val="single" w:color="C9D0DC" w:sz="4"/>
+              <w:right w:val="single" w:color="C9D0DC" w:sz="4"/>
+            </w:tcBorders>
+            <w:tcMar>
+              <w:top w:type="dxa" w:w="70"/>
+              <w:left w:type="dxa" w:w="100"/>
+              <w:bottom w:type="dxa" w:w="70"/>
+              <w:right w:type="dxa" w:w="100"/>
+            </w:tcMar>
+            <w:vAlign w:val="top"/>
+          </w:tcPr>
+          <w:p>
+            <w:pPr>
+              <w:spacing w:after="0" w:before="0" w:line="264"/>
+            </w:pPr>
+            <w:r>
+              <w:rPr>
+                <w:rFonts w:ascii="Arial" w:cs="Arial" w:eastAsia="Arial" w:hAnsi="Arial"/>
+                <w:b/>
+                <w:bCs/>
+                <w:color w:val="5B6477"/>
+                <w:sz w:val="16"/>
+                <w:szCs w:val="16"/>
+              </w:rPr>
+              <w:t xml:space="preserve">SA-52</w:t>
+            </w:r>
+          </w:p>
+        </w:tc>
+        <w:tc>
+          <w:tcPr>
+            <w:tcW w:type="dxa" w:w="5480"/>
+            <w:tcBorders>
+              <w:top w:val="single" w:color="C9D0DC" w:sz="4"/>
+              <w:left w:val="single" w:color="C9D0DC" w:sz="4"/>
+              <w:bottom w:val="single" w:color="C9D0DC" w:sz="4"/>
+              <w:right w:val="single" w:color="C9D0DC" w:sz="4"/>
+            </w:tcBorders>
+            <w:tcMar>
+              <w:top w:type="dxa" w:w="70"/>
+              <w:left w:type="dxa" w:w="100"/>
+              <w:bottom w:type="dxa" w:w="70"/>
+              <w:right w:type="dxa" w:w="100"/>
+            </w:tcMar>
+            <w:vAlign w:val="top"/>
+          </w:tcPr>
+          <w:p>
+            <w:pPr>
+              <w:spacing w:after="40" w:before="0" w:line="264"/>
+            </w:pPr>
+            <w:r>
+              <w:rPr>
+                <w:rFonts w:ascii="Arial" w:cs="Arial" w:eastAsia="Arial" w:hAnsi="Arial"/>
+                <w:b/>
+                <w:bCs/>
+                <w:sz w:val="20"/>
+                <w:szCs w:val="20"/>
+              </w:rPr>
+              <w:t xml:space="preserve">Member reservations</w:t>
+            </w:r>
+          </w:p>
+          <w:p>
+            <w:pPr>
+              <w:spacing w:after="40" w:before="0" w:line="264"/>
+            </w:pPr>
+            <w:r>
+              <w:rPr>
+                <w:rFonts w:ascii="Arial" w:cs="Arial" w:eastAsia="Arial" w:hAnsi="Arial"/>
+                <w:i/>
+                <w:iCs/>
+                <w:color w:val="5B6477"/>
+                <w:sz w:val="15"/>
+                <w:szCs w:val="15"/>
+              </w:rPr>
+              <w:t xml:space="preserve">Flow F33 · Member program: vouchers, member prices, lost sales, insights and chat campaigns</w:t>
+            </w:r>
+          </w:p>
+          <w:p>
+            <w:pPr>
+              <w:spacing w:after="20" w:before="0" w:line="264"/>
+            </w:pPr>
+            <w:r>
+              <w:rPr>
+                <w:rFonts w:ascii="Arial" w:cs="Arial" w:eastAsia="Arial" w:hAnsi="Arial"/>
+                <w:color w:val="5B6477"/>
+                <w:sz w:val="19"/>
+                <w:szCs w:val="19"/>
+              </w:rPr>
+              <w:t xml:space="preserve">1.  </w:t>
+            </w:r>
+            <w:r>
+              <w:rPr>
+                <w:rFonts w:ascii="Arial" w:cs="Arial" w:eastAsia="Arial" w:hAnsi="Arial"/>
+                <w:sz w:val="19"/>
+                <w:szCs w:val="19"/>
+              </w:rPr>
+              <w:t xml:space="preserve">Open Member Reservations.</w:t>
+            </w:r>
+          </w:p>
+          <w:p>
+            <w:pPr>
+              <w:spacing w:after="20" w:before="0" w:line="264"/>
+            </w:pPr>
+            <w:r>
+              <w:rPr>
+                <w:rFonts w:ascii="Arial" w:cs="Arial" w:eastAsia="Arial" w:hAnsi="Arial"/>
+                <w:color w:val="5B6477"/>
+                <w:sz w:val="19"/>
+                <w:szCs w:val="19"/>
+              </w:rPr>
+              <w:t xml:space="preserve">2.  </w:t>
+            </w:r>
+            <w:r>
+              <w:rPr>
+                <w:rFonts w:ascii="Arial" w:cs="Arial" w:eastAsia="Arial" w:hAnsi="Arial"/>
+                <w:sz w:val="19"/>
+                <w:szCs w:val="19"/>
+              </w:rPr>
+              <w:t xml:space="preserve">Press Ready on a reservation, then Picked up.</w:t>
+            </w:r>
+          </w:p>
+          <w:p>
+            <w:pPr>
+              <w:spacing w:after="0" w:before="60" w:line="264"/>
+            </w:pPr>
+            <w:r>
+              <w:rPr>
+                <w:rFonts w:ascii="Arial" w:cs="Arial" w:eastAsia="Arial" w:hAnsi="Arial"/>
+                <w:b/>
+                <w:bCs/>
+                <w:color w:val="0B1F3A"/>
+                <w:sz w:val="19"/>
+                <w:szCs w:val="19"/>
+              </w:rPr>
+              <w:t xml:space="preserve">You should see: </w:t>
+            </w:r>
+            <w:r>
+              <w:rPr>
+                <w:rFonts w:ascii="Arial" w:cs="Arial" w:eastAsia="Arial" w:hAnsi="Arial"/>
+                <w:sz w:val="19"/>
+                <w:szCs w:val="19"/>
+              </w:rPr>
+              <w:t xml:space="preserve">The member is told when it is Ready (SMS or email if set up). Only your branch's reservations show.</w:t>
             </w:r>
           </w:p>
         </w:tc>
@@ -14763,7 +15917,7 @@
                 <w:sz w:val="17"/>
                 <w:szCs w:val="17"/>
               </w:rPr>
-              <w:t xml:space="preserve">Passed (of 52)</w:t>
+              <w:t xml:space="preserve">Passed (of 56)</w:t>
             </w:r>
           </w:p>
         </w:tc>

</xml_diff>

<commit_message>
Franchise AR: unpaid DR goods earn 2% penalty and 0.1% daily interest after the due date (recalculated by themselves when a sale is edited); breakdown of Total goods AR, shipping AR, penalty and interest AR per franchise; a credit sale's due date cannot be before the sale date; guides, decisions, simulation step and acceptance tests updated
Co-Authored-By: Claude Sonnet 5.5 <noreply@anthropic.com>
Claude-Session: https://claude.ai/code/session_01611rAAsm4xgneCTG3N9mPf
</commit_message>
<xml_diff>
--- a/docs/acceptance-test/per-user/09-sales.westave.docx
+++ b/docs/acceptance-test/per-user/09-sales.westave.docx
@@ -19239,7 +19239,29 @@
                 <w:sz w:val="19"/>
                 <w:szCs w:val="19"/>
               </w:rPr>
-              <w:t xml:space="preserve">New Sale → customer: a franchise → save the DR.</w:t>
+              <w:t xml:space="preserve">New Sale → customer: a franchise → pay on credit and choose a due date earlier than today → Save.</w:t>
+            </w:r>
+          </w:p>
+          <w:p>
+            <w:pPr>
+              <w:spacing w:after="20" w:before="0" w:line="264"/>
+            </w:pPr>
+            <w:r>
+              <w:rPr>
+                <w:rFonts w:ascii="Arial" w:cs="Arial" w:eastAsia="Arial" w:hAnsi="Arial"/>
+                <w:color w:val="5B6477"/>
+                <w:sz w:val="19"/>
+                <w:szCs w:val="19"/>
+              </w:rPr>
+              <w:t xml:space="preserve">2.  </w:t>
+            </w:r>
+            <w:r>
+              <w:rPr>
+                <w:rFonts w:ascii="Arial" w:cs="Arial" w:eastAsia="Arial" w:hAnsi="Arial"/>
+                <w:sz w:val="19"/>
+                <w:szCs w:val="19"/>
+              </w:rPr>
+              <w:t xml:space="preserve">Choose a due date from today on → save the DR.</w:t>
             </w:r>
           </w:p>
           <w:p>
@@ -19263,7 +19285,7 @@
                 <w:sz w:val="19"/>
                 <w:szCs w:val="19"/>
               </w:rPr>
-              <w:t xml:space="preserve">The franchise is notified and confirms the DR; the DR follows the franchise DR steps.</w:t>
+              <w:t xml:space="preserve">A due date before the sale date is refused. The DR is saved, the franchise is notified and confirms the DR; the DR follows the franchise DR steps.</w:t>
             </w:r>
           </w:p>
         </w:tc>

</xml_diff>

<commit_message>
Edit a DR until its day closes (same date, old voided, stock/AR follow) with a DRs entered list at the bottom of the Daily Sales Report; Sales figure of the Daily Inventory Report lists its DRs with links to the sale and to the Daily Sales Report of that day; Wheysted member / phone / email / 6-Pack boxes only for retail sales; Franchise AR page no longer crashes on an older server response; guides, decisions, simulation steps and acceptance tests updated
Co-Authored-By: Claude Sonnet 5.5 <noreply@anthropic.com>
Claude-Session: https://claude.ai/code/session_01611rAAsm4xgneCTG3N9mPf
</commit_message>
<xml_diff>
--- a/docs/acceptance-test/per-user/09-sales.westave.docx
+++ b/docs/acceptance-test/per-user/09-sales.westave.docx
@@ -117,7 +117,7 @@
           <w:sz w:val="18"/>
           <w:szCs w:val="18"/>
         </w:rPr>
-        <w:t xml:space="preserve">  ·  69 checks</w:t>
+        <w:t xml:space="preserve">  ·  71 checks</w:t>
       </w:r>
     </w:p>
     <w:tbl>
@@ -19547,6 +19547,594 @@
                 <w:szCs w:val="19"/>
               </w:rPr>
               <w:t xml:space="preserve">The Warehouse In-Charge sees it with the products filled in and prepares the pull-out.</w:t>
+            </w:r>
+          </w:p>
+        </w:tc>
+        <w:tc>
+          <w:tcPr>
+            <w:tcW w:type="dxa" w:w="620"/>
+            <w:tcBorders>
+              <w:top w:val="single" w:color="C9D0DC" w:sz="4"/>
+              <w:left w:val="single" w:color="C9D0DC" w:sz="4"/>
+              <w:bottom w:val="single" w:color="C9D0DC" w:sz="4"/>
+              <w:right w:val="single" w:color="C9D0DC" w:sz="4"/>
+            </w:tcBorders>
+            <w:tcMar>
+              <w:top w:type="dxa" w:w="70"/>
+              <w:left w:type="dxa" w:w="100"/>
+              <w:bottom w:type="dxa" w:w="70"/>
+              <w:right w:type="dxa" w:w="100"/>
+            </w:tcMar>
+            <w:vAlign w:val="center"/>
+          </w:tcPr>
+          <w:p>
+            <w:pPr>
+              <w:spacing w:after="0" w:before="0" w:line="264"/>
+              <w:jc w:val="center"/>
+            </w:pPr>
+            <w:r>
+              <w:rPr>
+                <w:rFonts w:ascii="Arial" w:cs="Arial" w:eastAsia="Arial" w:hAnsi="Arial"/>
+                <w:sz w:val="30"/>
+                <w:szCs w:val="30"/>
+              </w:rPr>
+              <w:t xml:space="preserve">☐</w:t>
+            </w:r>
+          </w:p>
+        </w:tc>
+        <w:tc>
+          <w:tcPr>
+            <w:tcW w:type="dxa" w:w="620"/>
+            <w:tcBorders>
+              <w:top w:val="single" w:color="C9D0DC" w:sz="4"/>
+              <w:left w:val="single" w:color="C9D0DC" w:sz="4"/>
+              <w:bottom w:val="single" w:color="C9D0DC" w:sz="4"/>
+              <w:right w:val="single" w:color="C9D0DC" w:sz="4"/>
+            </w:tcBorders>
+            <w:tcMar>
+              <w:top w:type="dxa" w:w="70"/>
+              <w:left w:type="dxa" w:w="100"/>
+              <w:bottom w:type="dxa" w:w="70"/>
+              <w:right w:type="dxa" w:w="100"/>
+            </w:tcMar>
+            <w:vAlign w:val="center"/>
+          </w:tcPr>
+          <w:p>
+            <w:pPr>
+              <w:spacing w:after="0" w:before="0" w:line="264"/>
+              <w:jc w:val="center"/>
+            </w:pPr>
+            <w:r>
+              <w:rPr>
+                <w:rFonts w:ascii="Arial" w:cs="Arial" w:eastAsia="Arial" w:hAnsi="Arial"/>
+                <w:sz w:val="30"/>
+                <w:szCs w:val="30"/>
+              </w:rPr>
+              <w:t xml:space="preserve">☐</w:t>
+            </w:r>
+          </w:p>
+        </w:tc>
+        <w:tc>
+          <w:tcPr>
+            <w:tcW w:type="dxa" w:w="620"/>
+            <w:tcBorders>
+              <w:top w:val="single" w:color="C9D0DC" w:sz="4"/>
+              <w:left w:val="single" w:color="C9D0DC" w:sz="4"/>
+              <w:bottom w:val="single" w:color="C9D0DC" w:sz="4"/>
+              <w:right w:val="single" w:color="C9D0DC" w:sz="4"/>
+            </w:tcBorders>
+            <w:tcMar>
+              <w:top w:type="dxa" w:w="70"/>
+              <w:left w:type="dxa" w:w="100"/>
+              <w:bottom w:type="dxa" w:w="70"/>
+              <w:right w:type="dxa" w:w="100"/>
+            </w:tcMar>
+            <w:vAlign w:val="center"/>
+          </w:tcPr>
+          <w:p>
+            <w:pPr>
+              <w:spacing w:after="0" w:before="0" w:line="264"/>
+              <w:jc w:val="center"/>
+            </w:pPr>
+            <w:r>
+              <w:rPr>
+                <w:rFonts w:ascii="Arial" w:cs="Arial" w:eastAsia="Arial" w:hAnsi="Arial"/>
+                <w:sz w:val="30"/>
+                <w:szCs w:val="30"/>
+              </w:rPr>
+              <w:t xml:space="preserve">☐</w:t>
+            </w:r>
+          </w:p>
+        </w:tc>
+        <w:tc>
+          <w:tcPr>
+            <w:tcW w:type="dxa" w:w="2040"/>
+            <w:tcBorders>
+              <w:top w:val="single" w:color="C9D0DC" w:sz="4"/>
+              <w:left w:val="single" w:color="C9D0DC" w:sz="4"/>
+              <w:bottom w:val="single" w:color="C9D0DC" w:sz="4"/>
+              <w:right w:val="single" w:color="C9D0DC" w:sz="4"/>
+            </w:tcBorders>
+            <w:tcMar>
+              <w:top w:type="dxa" w:w="70"/>
+              <w:left w:type="dxa" w:w="100"/>
+              <w:bottom w:type="dxa" w:w="70"/>
+              <w:right w:type="dxa" w:w="100"/>
+            </w:tcMar>
+            <w:vAlign w:val="top"/>
+          </w:tcPr>
+          <w:p>
+            <w:pPr>
+              <w:spacing w:after="0" w:before="0" w:line="264"/>
+            </w:pPr>
+            <w:r>
+              <w:rPr>
+                <w:rFonts w:ascii="Arial" w:cs="Arial" w:eastAsia="Arial" w:hAnsi="Arial"/>
+                <w:sz w:val="19"/>
+                <w:szCs w:val="19"/>
+              </w:rPr>
+              <w:t xml:space="preserve"> </w:t>
+            </w:r>
+          </w:p>
+        </w:tc>
+      </w:tr>
+      <w:tr>
+        <w:trPr>
+          <w:cantSplit/>
+        </w:trPr>
+        <w:tc>
+          <w:tcPr>
+            <w:tcW w:type="dxa" w:w="860"/>
+            <w:tcBorders>
+              <w:top w:val="single" w:color="C9D0DC" w:sz="4"/>
+              <w:left w:val="single" w:color="C9D0DC" w:sz="4"/>
+              <w:bottom w:val="single" w:color="C9D0DC" w:sz="4"/>
+              <w:right w:val="single" w:color="C9D0DC" w:sz="4"/>
+            </w:tcBorders>
+            <w:tcMar>
+              <w:top w:type="dxa" w:w="70"/>
+              <w:left w:type="dxa" w:w="100"/>
+              <w:bottom w:type="dxa" w:w="70"/>
+              <w:right w:type="dxa" w:w="100"/>
+            </w:tcMar>
+            <w:vAlign w:val="top"/>
+          </w:tcPr>
+          <w:p>
+            <w:pPr>
+              <w:spacing w:after="0" w:before="0" w:line="264"/>
+            </w:pPr>
+            <w:r>
+              <w:rPr>
+                <w:rFonts w:ascii="Arial" w:cs="Arial" w:eastAsia="Arial" w:hAnsi="Arial"/>
+                <w:b/>
+                <w:bCs/>
+                <w:color w:val="5B6477"/>
+                <w:sz w:val="16"/>
+                <w:szCs w:val="16"/>
+              </w:rPr>
+              <w:t xml:space="preserve">SA-ED</w:t>
+            </w:r>
+          </w:p>
+        </w:tc>
+        <w:tc>
+          <w:tcPr>
+            <w:tcW w:type="dxa" w:w="5480"/>
+            <w:tcBorders>
+              <w:top w:val="single" w:color="C9D0DC" w:sz="4"/>
+              <w:left w:val="single" w:color="C9D0DC" w:sz="4"/>
+              <w:bottom w:val="single" w:color="C9D0DC" w:sz="4"/>
+              <w:right w:val="single" w:color="C9D0DC" w:sz="4"/>
+            </w:tcBorders>
+            <w:tcMar>
+              <w:top w:type="dxa" w:w="70"/>
+              <w:left w:type="dxa" w:w="100"/>
+              <w:bottom w:type="dxa" w:w="70"/>
+              <w:right w:type="dxa" w:w="100"/>
+            </w:tcMar>
+            <w:vAlign w:val="top"/>
+          </w:tcPr>
+          <w:p>
+            <w:pPr>
+              <w:spacing w:after="40" w:before="0" w:line="264"/>
+            </w:pPr>
+            <w:r>
+              <w:rPr>
+                <w:rFonts w:ascii="Arial" w:cs="Arial" w:eastAsia="Arial" w:hAnsi="Arial"/>
+                <w:b/>
+                <w:bCs/>
+                <w:sz w:val="20"/>
+                <w:szCs w:val="20"/>
+              </w:rPr>
+              <w:t xml:space="preserve">Edit a DR before the day closes</w:t>
+            </w:r>
+          </w:p>
+          <w:p>
+            <w:pPr>
+              <w:spacing w:after="40" w:before="0" w:line="264"/>
+            </w:pPr>
+            <w:r>
+              <w:rPr>
+                <w:rFonts w:ascii="Arial" w:cs="Arial" w:eastAsia="Arial" w:hAnsi="Arial"/>
+                <w:i/>
+                <w:iCs/>
+                <w:color w:val="5B6477"/>
+                <w:sz w:val="15"/>
+                <w:szCs w:val="15"/>
+              </w:rPr>
+              <w:t xml:space="preserve">Flow F43 · Edit a DR, DR list and sales links</w:t>
+            </w:r>
+          </w:p>
+          <w:p>
+            <w:pPr>
+              <w:spacing w:after="20" w:before="0" w:line="264"/>
+            </w:pPr>
+            <w:r>
+              <w:rPr>
+                <w:rFonts w:ascii="Arial" w:cs="Arial" w:eastAsia="Arial" w:hAnsi="Arial"/>
+                <w:color w:val="5B6477"/>
+                <w:sz w:val="19"/>
+                <w:szCs w:val="19"/>
+              </w:rPr>
+              <w:t xml:space="preserve">1.  </w:t>
+            </w:r>
+            <w:r>
+              <w:rPr>
+                <w:rFonts w:ascii="Arial" w:cs="Arial" w:eastAsia="Arial" w:hAnsi="Arial"/>
+                <w:sz w:val="19"/>
+                <w:szCs w:val="19"/>
+              </w:rPr>
+              <w:t xml:space="preserve">Reports → Daily Sales Report: read the DRs entered list at the bottom and click a DR.</w:t>
+            </w:r>
+          </w:p>
+          <w:p>
+            <w:pPr>
+              <w:spacing w:after="20" w:before="0" w:line="264"/>
+            </w:pPr>
+            <w:r>
+              <w:rPr>
+                <w:rFonts w:ascii="Arial" w:cs="Arial" w:eastAsia="Arial" w:hAnsi="Arial"/>
+                <w:color w:val="5B6477"/>
+                <w:sz w:val="19"/>
+                <w:szCs w:val="19"/>
+              </w:rPr>
+              <w:t xml:space="preserve">2.  </w:t>
+            </w:r>
+            <w:r>
+              <w:rPr>
+                <w:rFonts w:ascii="Arial" w:cs="Arial" w:eastAsia="Arial" w:hAnsi="Arial"/>
+                <w:sz w:val="19"/>
+                <w:szCs w:val="19"/>
+              </w:rPr>
+              <w:t xml:space="preserve">Press Edit on a DR → change a quantity and the customer name → Save the corrected DR.</w:t>
+            </w:r>
+          </w:p>
+          <w:p>
+            <w:pPr>
+              <w:spacing w:after="20" w:before="0" w:line="264"/>
+            </w:pPr>
+            <w:r>
+              <w:rPr>
+                <w:rFonts w:ascii="Arial" w:cs="Arial" w:eastAsia="Arial" w:hAnsi="Arial"/>
+                <w:color w:val="5B6477"/>
+                <w:sz w:val="19"/>
+                <w:szCs w:val="19"/>
+              </w:rPr>
+              <w:t xml:space="preserve">3.  </w:t>
+            </w:r>
+            <w:r>
+              <w:rPr>
+                <w:rFonts w:ascii="Arial" w:cs="Arial" w:eastAsia="Arial" w:hAnsi="Arial"/>
+                <w:sz w:val="19"/>
+                <w:szCs w:val="19"/>
+              </w:rPr>
+              <w:t xml:space="preserve">Submit the report of the day, then open a DR.</w:t>
+            </w:r>
+          </w:p>
+          <w:p>
+            <w:pPr>
+              <w:spacing w:after="0" w:before="60" w:line="264"/>
+            </w:pPr>
+            <w:r>
+              <w:rPr>
+                <w:rFonts w:ascii="Arial" w:cs="Arial" w:eastAsia="Arial" w:hAnsi="Arial"/>
+                <w:b/>
+                <w:bCs/>
+                <w:color w:val="0B1F3A"/>
+                <w:sz w:val="19"/>
+                <w:szCs w:val="19"/>
+              </w:rPr>
+              <w:t xml:space="preserve">You should see: </w:t>
+            </w:r>
+            <w:r>
+              <w:rPr>
+                <w:rFonts w:ascii="Arial" w:cs="Arial" w:eastAsia="Arial" w:hAnsi="Arial"/>
+                <w:sz w:val="19"/>
+                <w:szCs w:val="19"/>
+              </w:rPr>
+              <w:t xml:space="preserve">The DR keeps its date and the totals follow. After the report is submitted the Edit button is gone and the card tells you to use a post-close edit request.</w:t>
+            </w:r>
+          </w:p>
+        </w:tc>
+        <w:tc>
+          <w:tcPr>
+            <w:tcW w:type="dxa" w:w="620"/>
+            <w:tcBorders>
+              <w:top w:val="single" w:color="C9D0DC" w:sz="4"/>
+              <w:left w:val="single" w:color="C9D0DC" w:sz="4"/>
+              <w:bottom w:val="single" w:color="C9D0DC" w:sz="4"/>
+              <w:right w:val="single" w:color="C9D0DC" w:sz="4"/>
+            </w:tcBorders>
+            <w:tcMar>
+              <w:top w:type="dxa" w:w="70"/>
+              <w:left w:type="dxa" w:w="100"/>
+              <w:bottom w:type="dxa" w:w="70"/>
+              <w:right w:type="dxa" w:w="100"/>
+            </w:tcMar>
+            <w:vAlign w:val="center"/>
+          </w:tcPr>
+          <w:p>
+            <w:pPr>
+              <w:spacing w:after="0" w:before="0" w:line="264"/>
+              <w:jc w:val="center"/>
+            </w:pPr>
+            <w:r>
+              <w:rPr>
+                <w:rFonts w:ascii="Arial" w:cs="Arial" w:eastAsia="Arial" w:hAnsi="Arial"/>
+                <w:sz w:val="30"/>
+                <w:szCs w:val="30"/>
+              </w:rPr>
+              <w:t xml:space="preserve">☐</w:t>
+            </w:r>
+          </w:p>
+        </w:tc>
+        <w:tc>
+          <w:tcPr>
+            <w:tcW w:type="dxa" w:w="620"/>
+            <w:tcBorders>
+              <w:top w:val="single" w:color="C9D0DC" w:sz="4"/>
+              <w:left w:val="single" w:color="C9D0DC" w:sz="4"/>
+              <w:bottom w:val="single" w:color="C9D0DC" w:sz="4"/>
+              <w:right w:val="single" w:color="C9D0DC" w:sz="4"/>
+            </w:tcBorders>
+            <w:tcMar>
+              <w:top w:type="dxa" w:w="70"/>
+              <w:left w:type="dxa" w:w="100"/>
+              <w:bottom w:type="dxa" w:w="70"/>
+              <w:right w:type="dxa" w:w="100"/>
+            </w:tcMar>
+            <w:vAlign w:val="center"/>
+          </w:tcPr>
+          <w:p>
+            <w:pPr>
+              <w:spacing w:after="0" w:before="0" w:line="264"/>
+              <w:jc w:val="center"/>
+            </w:pPr>
+            <w:r>
+              <w:rPr>
+                <w:rFonts w:ascii="Arial" w:cs="Arial" w:eastAsia="Arial" w:hAnsi="Arial"/>
+                <w:sz w:val="30"/>
+                <w:szCs w:val="30"/>
+              </w:rPr>
+              <w:t xml:space="preserve">☐</w:t>
+            </w:r>
+          </w:p>
+        </w:tc>
+        <w:tc>
+          <w:tcPr>
+            <w:tcW w:type="dxa" w:w="620"/>
+            <w:tcBorders>
+              <w:top w:val="single" w:color="C9D0DC" w:sz="4"/>
+              <w:left w:val="single" w:color="C9D0DC" w:sz="4"/>
+              <w:bottom w:val="single" w:color="C9D0DC" w:sz="4"/>
+              <w:right w:val="single" w:color="C9D0DC" w:sz="4"/>
+            </w:tcBorders>
+            <w:tcMar>
+              <w:top w:type="dxa" w:w="70"/>
+              <w:left w:type="dxa" w:w="100"/>
+              <w:bottom w:type="dxa" w:w="70"/>
+              <w:right w:type="dxa" w:w="100"/>
+            </w:tcMar>
+            <w:vAlign w:val="center"/>
+          </w:tcPr>
+          <w:p>
+            <w:pPr>
+              <w:spacing w:after="0" w:before="0" w:line="264"/>
+              <w:jc w:val="center"/>
+            </w:pPr>
+            <w:r>
+              <w:rPr>
+                <w:rFonts w:ascii="Arial" w:cs="Arial" w:eastAsia="Arial" w:hAnsi="Arial"/>
+                <w:sz w:val="30"/>
+                <w:szCs w:val="30"/>
+              </w:rPr>
+              <w:t xml:space="preserve">☐</w:t>
+            </w:r>
+          </w:p>
+        </w:tc>
+        <w:tc>
+          <w:tcPr>
+            <w:tcW w:type="dxa" w:w="2040"/>
+            <w:tcBorders>
+              <w:top w:val="single" w:color="C9D0DC" w:sz="4"/>
+              <w:left w:val="single" w:color="C9D0DC" w:sz="4"/>
+              <w:bottom w:val="single" w:color="C9D0DC" w:sz="4"/>
+              <w:right w:val="single" w:color="C9D0DC" w:sz="4"/>
+            </w:tcBorders>
+            <w:tcMar>
+              <w:top w:type="dxa" w:w="70"/>
+              <w:left w:type="dxa" w:w="100"/>
+              <w:bottom w:type="dxa" w:w="70"/>
+              <w:right w:type="dxa" w:w="100"/>
+            </w:tcMar>
+            <w:vAlign w:val="top"/>
+          </w:tcPr>
+          <w:p>
+            <w:pPr>
+              <w:spacing w:after="0" w:before="0" w:line="264"/>
+            </w:pPr>
+            <w:r>
+              <w:rPr>
+                <w:rFonts w:ascii="Arial" w:cs="Arial" w:eastAsia="Arial" w:hAnsi="Arial"/>
+                <w:sz w:val="19"/>
+                <w:szCs w:val="19"/>
+              </w:rPr>
+              <w:t xml:space="preserve"> </w:t>
+            </w:r>
+          </w:p>
+        </w:tc>
+      </w:tr>
+      <w:tr>
+        <w:trPr>
+          <w:cantSplit/>
+        </w:trPr>
+        <w:tc>
+          <w:tcPr>
+            <w:tcW w:type="dxa" w:w="860"/>
+            <w:tcBorders>
+              <w:top w:val="single" w:color="C9D0DC" w:sz="4"/>
+              <w:left w:val="single" w:color="C9D0DC" w:sz="4"/>
+              <w:bottom w:val="single" w:color="C9D0DC" w:sz="4"/>
+              <w:right w:val="single" w:color="C9D0DC" w:sz="4"/>
+            </w:tcBorders>
+            <w:tcMar>
+              <w:top w:type="dxa" w:w="70"/>
+              <w:left w:type="dxa" w:w="100"/>
+              <w:bottom w:type="dxa" w:w="70"/>
+              <w:right w:type="dxa" w:w="100"/>
+            </w:tcMar>
+            <w:vAlign w:val="top"/>
+          </w:tcPr>
+          <w:p>
+            <w:pPr>
+              <w:spacing w:after="0" w:before="0" w:line="264"/>
+            </w:pPr>
+            <w:r>
+              <w:rPr>
+                <w:rFonts w:ascii="Arial" w:cs="Arial" w:eastAsia="Arial" w:hAnsi="Arial"/>
+                <w:b/>
+                <w:bCs/>
+                <w:color w:val="5B6477"/>
+                <w:sz w:val="16"/>
+                <w:szCs w:val="16"/>
+              </w:rPr>
+              <w:t xml:space="preserve">SA-MB</w:t>
+            </w:r>
+          </w:p>
+        </w:tc>
+        <w:tc>
+          <w:tcPr>
+            <w:tcW w:type="dxa" w:w="5480"/>
+            <w:tcBorders>
+              <w:top w:val="single" w:color="C9D0DC" w:sz="4"/>
+              <w:left w:val="single" w:color="C9D0DC" w:sz="4"/>
+              <w:bottom w:val="single" w:color="C9D0DC" w:sz="4"/>
+              <w:right w:val="single" w:color="C9D0DC" w:sz="4"/>
+            </w:tcBorders>
+            <w:tcMar>
+              <w:top w:type="dxa" w:w="70"/>
+              <w:left w:type="dxa" w:w="100"/>
+              <w:bottom w:type="dxa" w:w="70"/>
+              <w:right w:type="dxa" w:w="100"/>
+            </w:tcMar>
+            <w:vAlign w:val="top"/>
+          </w:tcPr>
+          <w:p>
+            <w:pPr>
+              <w:spacing w:after="40" w:before="0" w:line="264"/>
+            </w:pPr>
+            <w:r>
+              <w:rPr>
+                <w:rFonts w:ascii="Arial" w:cs="Arial" w:eastAsia="Arial" w:hAnsi="Arial"/>
+                <w:b/>
+                <w:bCs/>
+                <w:sz w:val="20"/>
+                <w:szCs w:val="20"/>
+              </w:rPr>
+              <w:t xml:space="preserve">Member boxes only for retail sales</w:t>
+            </w:r>
+          </w:p>
+          <w:p>
+            <w:pPr>
+              <w:spacing w:after="40" w:before="0" w:line="264"/>
+            </w:pPr>
+            <w:r>
+              <w:rPr>
+                <w:rFonts w:ascii="Arial" w:cs="Arial" w:eastAsia="Arial" w:hAnsi="Arial"/>
+                <w:i/>
+                <w:iCs/>
+                <w:color w:val="5B6477"/>
+                <w:sz w:val="15"/>
+                <w:szCs w:val="15"/>
+              </w:rPr>
+              <w:t xml:space="preserve">Flow F43 · Edit a DR, DR list and sales links</w:t>
+            </w:r>
+          </w:p>
+          <w:p>
+            <w:pPr>
+              <w:spacing w:after="20" w:before="0" w:line="264"/>
+            </w:pPr>
+            <w:r>
+              <w:rPr>
+                <w:rFonts w:ascii="Arial" w:cs="Arial" w:eastAsia="Arial" w:hAnsi="Arial"/>
+                <w:color w:val="5B6477"/>
+                <w:sz w:val="19"/>
+                <w:szCs w:val="19"/>
+              </w:rPr>
+              <w:t xml:space="preserve">1.  </w:t>
+            </w:r>
+            <w:r>
+              <w:rPr>
+                <w:rFonts w:ascii="Arial" w:cs="Arial" w:eastAsia="Arial" w:hAnsi="Arial"/>
+                <w:sz w:val="19"/>
+                <w:szCs w:val="19"/>
+              </w:rPr>
+              <w:t xml:space="preserve">New Sale → channel Walk-in: see the Wheysted member, phone / email and 6-Pack boxes.</w:t>
+            </w:r>
+          </w:p>
+          <w:p>
+            <w:pPr>
+              <w:spacing w:after="20" w:before="0" w:line="264"/>
+            </w:pPr>
+            <w:r>
+              <w:rPr>
+                <w:rFonts w:ascii="Arial" w:cs="Arial" w:eastAsia="Arial" w:hAnsi="Arial"/>
+                <w:color w:val="5B6477"/>
+                <w:sz w:val="19"/>
+                <w:szCs w:val="19"/>
+              </w:rPr>
+              <w:t xml:space="preserve">2.  </w:t>
+            </w:r>
+            <w:r>
+              <w:rPr>
+                <w:rFonts w:ascii="Arial" w:cs="Arial" w:eastAsia="Arial" w:hAnsi="Arial"/>
+                <w:sz w:val="19"/>
+                <w:szCs w:val="19"/>
+              </w:rPr>
+              <w:t xml:space="preserve">Change the channel to Franchise, then Dealer.</w:t>
+            </w:r>
+          </w:p>
+          <w:p>
+            <w:pPr>
+              <w:spacing w:after="0" w:before="60" w:line="264"/>
+            </w:pPr>
+            <w:r>
+              <w:rPr>
+                <w:rFonts w:ascii="Arial" w:cs="Arial" w:eastAsia="Arial" w:hAnsi="Arial"/>
+                <w:b/>
+                <w:bCs/>
+                <w:color w:val="0B1F3A"/>
+                <w:sz w:val="19"/>
+                <w:szCs w:val="19"/>
+              </w:rPr>
+              <w:t xml:space="preserve">You should see: </w:t>
+            </w:r>
+            <w:r>
+              <w:rPr>
+                <w:rFonts w:ascii="Arial" w:cs="Arial" w:eastAsia="Arial" w:hAnsi="Arial"/>
+                <w:sz w:val="19"/>
+                <w:szCs w:val="19"/>
+              </w:rPr>
+              <w:t xml:space="preserve">The member, phone / email and 6-Pack boxes disappear for Franchise, Dealer, Agent and Marketplace.</w:t>
             </w:r>
           </w:p>
         </w:tc>
@@ -19750,7 +20338,7 @@
                 <w:sz w:val="17"/>
                 <w:szCs w:val="17"/>
               </w:rPr>
-              <w:t xml:space="preserve">Passed (of 69)</w:t>
+              <w:t xml:space="preserve">Passed (of 71)</w:t>
             </w:r>
           </w:p>
         </w:tc>

</xml_diff>

<commit_message>
Editable online-platform income and card remittance: SRP and fees typed per order (Waybill Report) and per order of a draft payout; credit card amount really charged (difference to Other Income - Card Surcharge / Rounding, corrected later by Accounting); Card Remittances (tick card sales, type the net the bank credited, fee shared per sale, Accounting Head approves, posts Bank + MDR / AR - Credit Card); dashboard card for card sales waiting for the bank; user guide, role guides, decisions, simulation steps and acceptance tests (flow F46) updated
Co-Authored-By: Claude Sonnet 5.5 <noreply@anthropic.com>
Claude-Session: https://claude.ai/code/session_01611rAAsm4xgneCTG3N9mPf
</commit_message>
<xml_diff>
--- a/docs/acceptance-test/per-user/09-sales.westave.docx
+++ b/docs/acceptance-test/per-user/09-sales.westave.docx
@@ -117,7 +117,7 @@
           <w:sz w:val="18"/>
           <w:szCs w:val="18"/>
         </w:rPr>
-        <w:t xml:space="preserve">  ·  72 checks</w:t>
+        <w:t xml:space="preserve">  ·  73 checks</w:t>
       </w:r>
     </w:p>
     <w:tbl>
@@ -20418,6 +20418,311 @@
                 <w:szCs w:val="19"/>
               </w:rPr>
               <w:t xml:space="preserve">HR is told of the reply. The branch charges list shows who was charged, what for and how much.</w:t>
+            </w:r>
+          </w:p>
+        </w:tc>
+        <w:tc>
+          <w:tcPr>
+            <w:tcW w:type="dxa" w:w="620"/>
+            <w:tcBorders>
+              <w:top w:val="single" w:color="C9D0DC" w:sz="4"/>
+              <w:left w:val="single" w:color="C9D0DC" w:sz="4"/>
+              <w:bottom w:val="single" w:color="C9D0DC" w:sz="4"/>
+              <w:right w:val="single" w:color="C9D0DC" w:sz="4"/>
+            </w:tcBorders>
+            <w:tcMar>
+              <w:top w:type="dxa" w:w="70"/>
+              <w:left w:type="dxa" w:w="100"/>
+              <w:bottom w:type="dxa" w:w="70"/>
+              <w:right w:type="dxa" w:w="100"/>
+            </w:tcMar>
+            <w:vAlign w:val="center"/>
+          </w:tcPr>
+          <w:p>
+            <w:pPr>
+              <w:spacing w:after="0" w:before="0" w:line="264"/>
+              <w:jc w:val="center"/>
+            </w:pPr>
+            <w:r>
+              <w:rPr>
+                <w:rFonts w:ascii="Arial" w:cs="Arial" w:eastAsia="Arial" w:hAnsi="Arial"/>
+                <w:sz w:val="30"/>
+                <w:szCs w:val="30"/>
+              </w:rPr>
+              <w:t xml:space="preserve">☐</w:t>
+            </w:r>
+          </w:p>
+        </w:tc>
+        <w:tc>
+          <w:tcPr>
+            <w:tcW w:type="dxa" w:w="620"/>
+            <w:tcBorders>
+              <w:top w:val="single" w:color="C9D0DC" w:sz="4"/>
+              <w:left w:val="single" w:color="C9D0DC" w:sz="4"/>
+              <w:bottom w:val="single" w:color="C9D0DC" w:sz="4"/>
+              <w:right w:val="single" w:color="C9D0DC" w:sz="4"/>
+            </w:tcBorders>
+            <w:tcMar>
+              <w:top w:type="dxa" w:w="70"/>
+              <w:left w:type="dxa" w:w="100"/>
+              <w:bottom w:type="dxa" w:w="70"/>
+              <w:right w:type="dxa" w:w="100"/>
+            </w:tcMar>
+            <w:vAlign w:val="center"/>
+          </w:tcPr>
+          <w:p>
+            <w:pPr>
+              <w:spacing w:after="0" w:before="0" w:line="264"/>
+              <w:jc w:val="center"/>
+            </w:pPr>
+            <w:r>
+              <w:rPr>
+                <w:rFonts w:ascii="Arial" w:cs="Arial" w:eastAsia="Arial" w:hAnsi="Arial"/>
+                <w:sz w:val="30"/>
+                <w:szCs w:val="30"/>
+              </w:rPr>
+              <w:t xml:space="preserve">☐</w:t>
+            </w:r>
+          </w:p>
+        </w:tc>
+        <w:tc>
+          <w:tcPr>
+            <w:tcW w:type="dxa" w:w="620"/>
+            <w:tcBorders>
+              <w:top w:val="single" w:color="C9D0DC" w:sz="4"/>
+              <w:left w:val="single" w:color="C9D0DC" w:sz="4"/>
+              <w:bottom w:val="single" w:color="C9D0DC" w:sz="4"/>
+              <w:right w:val="single" w:color="C9D0DC" w:sz="4"/>
+            </w:tcBorders>
+            <w:tcMar>
+              <w:top w:type="dxa" w:w="70"/>
+              <w:left w:type="dxa" w:w="100"/>
+              <w:bottom w:type="dxa" w:w="70"/>
+              <w:right w:type="dxa" w:w="100"/>
+            </w:tcMar>
+            <w:vAlign w:val="center"/>
+          </w:tcPr>
+          <w:p>
+            <w:pPr>
+              <w:spacing w:after="0" w:before="0" w:line="264"/>
+              <w:jc w:val="center"/>
+            </w:pPr>
+            <w:r>
+              <w:rPr>
+                <w:rFonts w:ascii="Arial" w:cs="Arial" w:eastAsia="Arial" w:hAnsi="Arial"/>
+                <w:sz w:val="30"/>
+                <w:szCs w:val="30"/>
+              </w:rPr>
+              <w:t xml:space="preserve">☐</w:t>
+            </w:r>
+          </w:p>
+        </w:tc>
+        <w:tc>
+          <w:tcPr>
+            <w:tcW w:type="dxa" w:w="2040"/>
+            <w:tcBorders>
+              <w:top w:val="single" w:color="C9D0DC" w:sz="4"/>
+              <w:left w:val="single" w:color="C9D0DC" w:sz="4"/>
+              <w:bottom w:val="single" w:color="C9D0DC" w:sz="4"/>
+              <w:right w:val="single" w:color="C9D0DC" w:sz="4"/>
+            </w:tcBorders>
+            <w:tcMar>
+              <w:top w:type="dxa" w:w="70"/>
+              <w:left w:type="dxa" w:w="100"/>
+              <w:bottom w:type="dxa" w:w="70"/>
+              <w:right w:type="dxa" w:w="100"/>
+            </w:tcMar>
+            <w:vAlign w:val="top"/>
+          </w:tcPr>
+          <w:p>
+            <w:pPr>
+              <w:spacing w:after="0" w:before="0" w:line="264"/>
+            </w:pPr>
+            <w:r>
+              <w:rPr>
+                <w:rFonts w:ascii="Arial" w:cs="Arial" w:eastAsia="Arial" w:hAnsi="Arial"/>
+                <w:sz w:val="19"/>
+                <w:szCs w:val="19"/>
+              </w:rPr>
+              <w:t xml:space="preserve"> </w:t>
+            </w:r>
+          </w:p>
+        </w:tc>
+      </w:tr>
+      <w:tr>
+        <w:trPr>
+          <w:cantSplit/>
+        </w:trPr>
+        <w:tc>
+          <w:tcPr>
+            <w:tcW w:type="dxa" w:w="860"/>
+            <w:tcBorders>
+              <w:top w:val="single" w:color="C9D0DC" w:sz="4"/>
+              <w:left w:val="single" w:color="C9D0DC" w:sz="4"/>
+              <w:bottom w:val="single" w:color="C9D0DC" w:sz="4"/>
+              <w:right w:val="single" w:color="C9D0DC" w:sz="4"/>
+            </w:tcBorders>
+            <w:tcMar>
+              <w:top w:type="dxa" w:w="70"/>
+              <w:left w:type="dxa" w:w="100"/>
+              <w:bottom w:type="dxa" w:w="70"/>
+              <w:right w:type="dxa" w:w="100"/>
+            </w:tcMar>
+            <w:vAlign w:val="top"/>
+          </w:tcPr>
+          <w:p>
+            <w:pPr>
+              <w:spacing w:after="0" w:before="0" w:line="264"/>
+            </w:pPr>
+            <w:r>
+              <w:rPr>
+                <w:rFonts w:ascii="Arial" w:cs="Arial" w:eastAsia="Arial" w:hAnsi="Arial"/>
+                <w:b/>
+                <w:bCs/>
+                <w:color w:val="5B6477"/>
+                <w:sz w:val="16"/>
+                <w:szCs w:val="16"/>
+              </w:rPr>
+              <w:t xml:space="preserve">SA-CARD</w:t>
+            </w:r>
+          </w:p>
+        </w:tc>
+        <w:tc>
+          <w:tcPr>
+            <w:tcW w:type="dxa" w:w="5480"/>
+            <w:tcBorders>
+              <w:top w:val="single" w:color="C9D0DC" w:sz="4"/>
+              <w:left w:val="single" w:color="C9D0DC" w:sz="4"/>
+              <w:bottom w:val="single" w:color="C9D0DC" w:sz="4"/>
+              <w:right w:val="single" w:color="C9D0DC" w:sz="4"/>
+            </w:tcBorders>
+            <w:tcMar>
+              <w:top w:type="dxa" w:w="70"/>
+              <w:left w:type="dxa" w:w="100"/>
+              <w:bottom w:type="dxa" w:w="70"/>
+              <w:right w:type="dxa" w:w="100"/>
+            </w:tcMar>
+            <w:vAlign w:val="top"/>
+          </w:tcPr>
+          <w:p>
+            <w:pPr>
+              <w:spacing w:after="40" w:before="0" w:line="264"/>
+            </w:pPr>
+            <w:r>
+              <w:rPr>
+                <w:rFonts w:ascii="Arial" w:cs="Arial" w:eastAsia="Arial" w:hAnsi="Arial"/>
+                <w:b/>
+                <w:bCs/>
+                <w:sz w:val="20"/>
+                <w:szCs w:val="20"/>
+              </w:rPr>
+              <w:t xml:space="preserve">Card amount different from the total</w:t>
+            </w:r>
+          </w:p>
+          <w:p>
+            <w:pPr>
+              <w:spacing w:after="40" w:before="0" w:line="264"/>
+            </w:pPr>
+            <w:r>
+              <w:rPr>
+                <w:rFonts w:ascii="Arial" w:cs="Arial" w:eastAsia="Arial" w:hAnsi="Arial"/>
+                <w:i/>
+                <w:iCs/>
+                <w:color w:val="5B6477"/>
+                <w:sz w:val="15"/>
+                <w:szCs w:val="15"/>
+              </w:rPr>
+              <w:t xml:space="preserve">Flow F46 · Editable online income, card amount and card remittance</w:t>
+            </w:r>
+          </w:p>
+          <w:p>
+            <w:pPr>
+              <w:spacing w:after="20" w:before="0" w:line="264"/>
+            </w:pPr>
+            <w:r>
+              <w:rPr>
+                <w:rFonts w:ascii="Arial" w:cs="Arial" w:eastAsia="Arial" w:hAnsi="Arial"/>
+                <w:color w:val="5B6477"/>
+                <w:sz w:val="19"/>
+                <w:szCs w:val="19"/>
+              </w:rPr>
+              <w:t xml:space="preserve">1.  </w:t>
+            </w:r>
+            <w:r>
+              <w:rPr>
+                <w:rFonts w:ascii="Arial" w:cs="Arial" w:eastAsia="Arial" w:hAnsi="Arial"/>
+                <w:sz w:val="19"/>
+                <w:szCs w:val="19"/>
+              </w:rPr>
+              <w:t xml:space="preserve">New Sale → Credit card → fill MID, slip, approval, batch and upload the slip.</w:t>
+            </w:r>
+          </w:p>
+          <w:p>
+            <w:pPr>
+              <w:spacing w:after="20" w:before="0" w:line="264"/>
+            </w:pPr>
+            <w:r>
+              <w:rPr>
+                <w:rFonts w:ascii="Arial" w:cs="Arial" w:eastAsia="Arial" w:hAnsi="Arial"/>
+                <w:color w:val="5B6477"/>
+                <w:sz w:val="19"/>
+                <w:szCs w:val="19"/>
+              </w:rPr>
+              <w:t xml:space="preserve">2.  </w:t>
+            </w:r>
+            <w:r>
+              <w:rPr>
+                <w:rFonts w:ascii="Arial" w:cs="Arial" w:eastAsia="Arial" w:hAnsi="Arial"/>
+                <w:sz w:val="19"/>
+                <w:szCs w:val="19"/>
+              </w:rPr>
+              <w:t xml:space="preserve">Type an Amount charged on the card that differs from the total; the reason box appears.</w:t>
+            </w:r>
+          </w:p>
+          <w:p>
+            <w:pPr>
+              <w:spacing w:after="20" w:before="0" w:line="264"/>
+            </w:pPr>
+            <w:r>
+              <w:rPr>
+                <w:rFonts w:ascii="Arial" w:cs="Arial" w:eastAsia="Arial" w:hAnsi="Arial"/>
+                <w:color w:val="5B6477"/>
+                <w:sz w:val="19"/>
+                <w:szCs w:val="19"/>
+              </w:rPr>
+              <w:t xml:space="preserve">3.  </w:t>
+            </w:r>
+            <w:r>
+              <w:rPr>
+                <w:rFonts w:ascii="Arial" w:cs="Arial" w:eastAsia="Arial" w:hAnsi="Arial"/>
+                <w:sz w:val="19"/>
+                <w:szCs w:val="19"/>
+              </w:rPr>
+              <w:t xml:space="preserve">Review and save.</w:t>
+            </w:r>
+          </w:p>
+          <w:p>
+            <w:pPr>
+              <w:spacing w:after="0" w:before="60" w:line="264"/>
+            </w:pPr>
+            <w:r>
+              <w:rPr>
+                <w:rFonts w:ascii="Arial" w:cs="Arial" w:eastAsia="Arial" w:hAnsi="Arial"/>
+                <w:b/>
+                <w:bCs/>
+                <w:color w:val="0B1F3A"/>
+                <w:sz w:val="19"/>
+                <w:szCs w:val="19"/>
+              </w:rPr>
+              <w:t xml:space="preserve">You should see: </w:t>
+            </w:r>
+            <w:r>
+              <w:rPr>
+                <w:rFonts w:ascii="Arial" w:cs="Arial" w:eastAsia="Arial" w:hAnsi="Arial"/>
+                <w:sz w:val="19"/>
+                <w:szCs w:val="19"/>
+              </w:rPr>
+              <w:t xml:space="preserve">Saving without a reason is refused. The review shows what was charged on the card. The Daily Sales Report shows Card surcharge / rounding.</w:t>
             </w:r>
           </w:p>
         </w:tc>
@@ -20621,7 +20926,7 @@
                 <w:sz w:val="17"/>
                 <w:szCs w:val="17"/>
               </w:rPr>
-              <w:t xml:space="preserve">Passed (of 72)</w:t>
+              <w:t xml:space="preserve">Passed (of 73)</w:t>
             </w:r>
           </w:p>
         </w:tc>

</xml_diff>